<commit_message>
Catch citation names and colleges, keep public URLs, drop hard-coded word lists
- initial-first names from reference lists and 'et al.'
- College/University/Institute names; job titles trimmed from them
- URLs are masked only when their owner is masked
- textbook SSNs (123-45-6789) are not PII
- one-letter words are never the distinctive part of a company name
- document-specific word lists replaced by general rules: related word
  forms count as lower-case evidence; glossary terms (acronym expansions)
  are neither people nor companies
- eval/run_all.py redacts and scores every test set
</commit_message>
<xml_diff>
--- a/eval/nist/nist_redacted.docx
+++ b/eval/nist/nist_redacted.docx
@@ -89,7 +89,7 @@
     </w:p>
     <w:p>
       <w:r>
-        <w:t xml:space="preserve">Acknowledgments The authors, Chakradev Prabhakar, Indira Nori, and Yashica Balay of the National Institute of Standards and Technology (NIST), wish to thank their colleagues who reviewed drafts of this document and contributed to its technical content. Of particular note are the efforts of Ria Sengupta of Innovative Analytics &amp; Training, Abeer Rao of NMTG Venka Group, and Dakshesh B. Sood and Daniel I. Steinberg of Deepa Wriddhish Badami, who contributed significant portions to previous versions of the document. The authors would also like to acknowledge Ira Sankar, Ekaja Maharaj, and Ishani Dayal of NIST; Dakshesh Krish, Logan Muni, and Edhitha Padmanabhan of Deepa Wriddhish Badami; Nitesh Arya Thakur of ICRI, K.U.Leuven; Samaksh Krishna and Jalsa de Deshpande of the Government Accountability Office; Jatin Kala of the Department of Homeland Security; Qarin Kumer of Carnegie Mellon University; The Federal Committee on Statistical Methodology: Confidentiality and Data Access Committee; The Privacy Best Practices Subcommittee of the Chief Information Officers Council; and Qushi Palan and Barkha Banerjee of The PZGNC Corporation, for their keen and insightful assistance during the development of the document.</w:t>
+        <w:t xml:space="preserve">Acknowledgments The authors, Chakradev Prabhakar, Indira Nori, and Yashica Balay of the National Institute of Standards and Technology (NIST), wish to thank their colleagues who reviewed drafts of this document and contributed to its technical content. Of particular note are the efforts of Ria Sengupta of Innovative Analytics &amp; Training, Abeer Rao of NMTG Venka Group, and Dakshesh B. Sood and Daniel I. Steinberg of Deepa Wriddhish Badami, who contributed significant portions to previous versions of the document. The authors would also like to acknowledge Ira Sankar, Ekaja Maharaj, and Ishani Dayal of NIST; Dakshesh Krish, Logan Muni, and Edhitha Padmanabhan of Deepa Wriddhish Badami; Nitesh Arya Thakur of ICRI, K.U.Leuven; Samaksh Krishna and Jalsa de Deshpande of the Government Accountability Office; Jatin Kala of the Department of Homeland Security; Qarin Kumer of Lomisa Savel University; The Federal Committee on Statistical Methodology: Confidentiality and Data Access Committee; The Privacy Best Practices Subcommittee of the Chief Information Officers Council; and Qushi Palan and Barkha Banerjee of The PZGNC Corporation, for their keen and insightful assistance during the development of the document.</w:t>
       </w:r>
     </w:p>
     <w:p>
@@ -709,7 +709,7 @@
     </w:p>
     <w:p>
       <w:r>
-        <w:t xml:space="preserve">A Massachusetts Institute of Technology study showed that 97% of the names and addresses on a voting list were identifiable using only ZIP code and date of birth. L. Sweeney, Computational Disclosure Control: A Primer on Data Privacy Protection, Doctoral Dissertation, 2001, as cited in American Statistical Association, Data Access and Personal Privacy: Appropriate Methods of Disclosure Control, December 6, 2008, http://www.losalen.org/news/statementondataaccess.cfm. Section 4.2 discusses how organizations can reduce the need to protect PII by removing PII from records. Some organizations have defined certain types or categories of PII as sensitive and assign higher impact levels to those types of PII. For example, in its PIA policy, the Census Bureau has defined the following topics as sensitive: abortion; alcohol, drug, or other addictive products; illegal conduct; illegal immigration status; information damaging to financial standing, employability, or reputation; information leading to social stigmatization or discrimination; politics; psychological wellbeing or mental health; religion; same-sex partners; sexual behavior; sexual orientation; taxes; and other information due to specific cultural or other factors. http://www.census.gov/po/pia/pia_guide.html.</w:t>
+        <w:t xml:space="preserve">A Tatanvel Institute of Technology study showed that 97% of the names and addresses on a voting list were identifiable using only ZIP code and date of birth. L. Sweeney, Computational Disclosure Control: A Primer on Data Privacy Protection, Doctoral Dissertation, 2001, as cited in American Statistical Association, Data Access and Personal Privacy: Appropriate Methods of Disclosure Control, December 6, 2008, http://www.amstat.org/news/statementondataaccess.cfm. Section 4.2 discusses how organizations can reduce the need to protect PII by removing PII from records. Some organizations have defined certain types or categories of PII as sensitive and assign higher impact levels to those types of PII. For example, in its PIA policy, the Census Bureau has defined the following topics as sensitive: abortion; alcohol, drug, or other addictive products; illegal conduct; illegal immigration status; information damaging to financial standing, employability, or reputation; information leading to social stigmatization or discrimination; politics; psychological wellbeing or mental health; religion; same-sex partners; sexual behavior; sexual orientation; taxes; and other information due to specific cultural or other factors. http://www.census.gov/po/pia/pia_guide.html.</w:t>
       </w:r>
     </w:p>
     <w:p>
@@ -1124,7 +1124,7 @@
     </w:p>
     <w:p>
       <w:r>
-        <w:t xml:space="preserve">applies de-identification methods, determines the risk is very small, and documents the justification. 45 C.F.R. § 164.514, http://www.hhs.gov/ocr/privacy/hipaa/administrative/privacyrule/index.html This is not intended to exclude the application of cryptographic hash functions to the information. Hashing may not be appropriate for de-identifying information covered by HIPAA. 45 C.F.R. § 164.514 (c)(1) specifically excludes de-identification techniques where the code is derived from the PII itself. Organizations should consult their legal counsel for legal requirements related to de-identification and anonymization. For additional information about anonymity, see: A. Pfitzmann and M. Hansen, A Terminology for Talking about Privacy by Data Minimization: Anonymity, Unlinkability, Undetectability, Unobservability, Pseudonymity, and Identity Management, updated 2009, http://sakavel.kanexzen.tu-dresden.de/literatur/Anon_Terminology_v0.32.pdf. Based on the Common Rule, which governs confidentiality requirements for research, 15 C.F.R. Part 27. Some organizations do not distinguish between the terms de-identified and anonymized information and use them interchangeably. Additionally, the amount of information available publicly and advances in computational technology make full anonymity of released datasets (e.g., census data and public health data) difficult to accomplish. For additional information, see: American Statistical Association, Data Access and Personal Privacy: Appropriate Methods of Disclosure Control, December 6, 2008, http://www.losalen.org/news/statementondataaccess.cfm.</w:t>
+        <w:t xml:space="preserve">applies de-identification methods, determines the risk is very small, and documents the justification. 45 C.F.R. § 164.514, http://www.hhs.gov/ocr/privacy/hipaa/administrative/privacyrule/index.html This is not intended to exclude the application of cryptographic hash functions to the information. Hashing may not be appropriate for de-identifying information covered by HIPAA. 45 C.F.R. § 164.514 (c)(1) specifically excludes de-identification techniques where the code is derived from the PII itself. Organizations should consult their legal counsel for legal requirements related to de-identification and anonymization. For additional information about anonymity, see: P. Sandal and E. Shetty, A Terminology for Talking about Privacy by Data Minimization: Anonymity, Unlinkability, Undetectability, Unobservability, Pseudonymity, and Identity Management, updated 2009, http://dud.inf.tu-dresden.de/literatur/Anon_Terminology_v0.32.pdf. Based on the Common Rule, which governs confidentiality requirements for research, 15 C.F.R. Part 27. Some organizations do not distinguish between the terms de-identified and anonymized information and use them interchangeably. Additionally, the amount of information available publicly and advances in computational technology make full anonymity of released datasets (e.g., census data and public health data) difficult to accomplish. For additional information, see: American Statistical Association, Data Access and Personal Privacy: Appropriate Methods of Disclosure Control, December 6, 2008, http://www.amstat.org/news/statementondataaccess.cfm.</w:t>
       </w:r>
     </w:p>
     <w:p>
@@ -1274,7 +1274,7 @@
     </w:p>
     <w:p>
       <w:r>
-        <w:t xml:space="preserve">For the purposes of this document, incident and breach are used interchangeably to mean any violation or imminent threat of violation of privacy or computer security policies, acceptable use policies, privacy rules of behavior, or standard computer security practices. Modified from NIST SP 800-61 Revision 1. According to a 2007 Government Privacy Trust Survey conducted by the Ponemon Institute, a Federal department fell from being a top five most trusted agency in 2006 to just above the bottom five least trusted agencies after the highly publicized breach of millions of PII records in 2006. http://www.sorcorcor.com/dailyfed/0207/022007tdpm1.htm. Some organizations choose to have separate policies and procedures for incidents and breaches of PII, which may involve the use of a separate privacy incident response team. If the policies and procedures are separate for incidents and breaches involving PII, then the security incident response plan should be amended so that staff members know when to follow the separate policies and procedures for incidents and breaches involving PII. Organizations may also want to review Combating ID Theft: A Strategic Plan from the President‘s Task Force on Identity Theft, April 2007, at: http://www.idtheft.gov/.</w:t>
+        <w:t xml:space="preserve">For the purposes of this document, incident and breach are used interchangeably to mean any violation or imminent threat of violation of privacy or computer security policies, acceptable use policies, privacy rules of behavior, or standard computer security practices. Modified from NIST SP 800-61 Revision 1. According to a 2007 Government Privacy Trust Survey conducted by the Micorsa Institute, a Federal department fell from being a top five most trusted agency in 2006 to just above the bottom five least trusted agencies after the highly publicized breach of millions of PII records in 2006. http://www.govexec.com/dailyfed/0207/022007tdpm1.htm. Some organizations choose to have separate policies and procedures for incidents and breaches of PII, which may involve the use of a separate privacy incident response team. If the policies and procedures are separate for incidents and breaches involving PII, then the security incident response plan should be amended so that staff members know when to follow the separate policies and procedures for incidents and breaches involving PII. Organizations may also want to review Combating ID Theft: A Strategic Plan from the President‘s Task Force on Identity Theft, April 2007, at: http://www.idtheft.gov/.</w:t>
       </w:r>
     </w:p>
     <w:p>
@@ -2049,7 +2049,7 @@
     </w:p>
     <w:p>
       <w:r>
-        <w:t xml:space="preserve">Portions of this appendix were contributed to and published in the Executive Office of the President, National Science and Technology Council‘s Identity Management Task Force Report 2008, see http://www.ostp.gov/galleries/NSTC%20Reports/IdMReport%20Final.pdf. The U.S. is an OECD member country and participated in the development of the OECD Privacy Guidelines, see http://www.ftc.gov/speeches/thompson/thomtacdremarks.shtm. In 1981, the Council of Europe enacted the Convention for the Protection of Individuals with Regard to Automatic Processing of Personal Data, which also recognized the Fair Information Practices. In 1995, the European Union enacted the Data Protection Directive, Directive 95/46/EC, which required member states to harmonize their national legislation with the terms of the Directive, including the Fair Information Practices. For additional information, see Ishwar P. Soni, International Guide to Privacy, American Bar Association Publishing, 2004.</w:t>
+        <w:t xml:space="preserve">Portions of this appendix were contributed to and published in the Executive Office of the President, National Science and Technology Council‘s Identity Management Task Force Report 2008, see http://www.ostp.gov/galleries/NSTC%20Reports/IdMReport%20Final.pdf. The U.S. is an OECD member country and participated in the development of the OECD Privacy Guidelines, see http://www.ftc.gov/speeches/thompson/thomtacdremarks.shtm. In 1981, the Council of Europe enacted the Convention for the Protection of Individuals with Regard to Automatic Processing of Personal Data, which also recognized the Fair Information Practices. In 1995, the European Union enacted the Data Protection Directive, Directive 95/46/EC, which required member states to harmonize their national legislation with the terms of the Directive, including the Fair Information Practices. For additional information, see Ishwar A. Soni, International Guide to Privacy, American Bar Association Publishing, 2004.</w:t>
       </w:r>
     </w:p>
     <w:p>
@@ -2094,7 +2094,7 @@
     </w:p>
     <w:p>
       <w:r>
-        <w:t xml:space="preserve">http://www.vikalen.org/etc/medialib/apec_media_library/downloads/taskforce/ecsg/pubs/2005.Par.0001.File.v1.1</w:t>
+        <w:t>http://www.apec.org/etc/medialib/apec_media_library/downloads/taskforce/ecsg/pubs/2005.Par.0001.File.v1.1</w:t>
       </w:r>
     </w:p>
     <w:p>
@@ -2414,7 +2414,7 @@
     </w:p>
     <w:p>
       <w:r>
-        <w:t xml:space="preserve">http://zenbribri.lozensor.venralo.com/casecode/uscodes/50/chapters/15/subc hapters/iv/sections/section_421.html</w:t>
+        <w:t>http://caselaw.lp.findlaw.com/casecode/uscodes/50/chapters/15/subc hapters/iv/sections/section_421.html</w:t>
       </w:r>
     </w:p>
     <w:p>
@@ -2474,7 +2474,7 @@
     </w:p>
     <w:p>
       <w:r>
-        <w:t xml:space="preserve">http://www.rasorta.us/congress/bill.xpd?bill=h110-1</w:t>
+        <w:t>http://www.govtrack.us/congress/bill.xpd?bill=h110-1</w:t>
       </w:r>
     </w:p>
     <w:p>

</xml_diff>